<commit_message>
docs: add an update note to the Main Document, fix typo and stray citation
Add a dated block on the status of derived knowledge (Foundation's automatic
epistemic layer is off; Cognition in Gaia-Cloud is the active layer and the
human-confirm path). Reword the "Foundation manages epistemic objects" line,
fix "bron.ls" to "bron. Als", drop the leftover "v3.0-foundation-v2 (1)".

The PDF copy is not regenerated: the original is a Google Docs export and a
local conversion would change its look. Re-export it from the docx.

Co-Authored-By: Claude Sonnet 5.5 <noreply@anthropic.com>
Claude-Session: https://claude.ai/code/session_01HcjGShkBMyGXC3jMHrsSFX
</commit_message>
<xml_diff>
--- a/docs/Project Gaia - Main Document.docx
+++ b/docs/Project Gaia - Main Document.docx
@@ -51,6 +51,30 @@
           <w:rFonts w:ascii="Google Sans" w:eastAsia="Google Sans" w:hAnsi="Google Sans" w:cs="Google Sans"/>
         </w:rPr>
         <w:t>.</w:t>
+      </w:r>
+    </w:p>
+    <w:p>
+      <w:r>
+        <w:rPr>
+          <w:b/>
+        </w:rPr>
+        <w:t>Bijwerking 16 oktober 2026 — status van afgeleide kennis</w:t>
+      </w:r>
+    </w:p>
+    <w:p>
+      <w:r>
+        <w:rPr>
+          <w:b w:val="0"/>
+        </w:rPr>
+        <w:t>Dit hoofdstuk beschrijft Foundation als bronlaag, en dat blijft zo. Eén ding is veranderd ten opzichte van de tekst hieronder: Foundation beheert afgeleide kennis (Evidence, Hypothesis, Fact) niet meer automatisch. De tabellen bestaan nog en alleen een mens bevestigt, maar de reflectie-engine, de promotie en de Hindsight-sync zijn uitgeschakeld in Foundation. Reden: ze vuurden tegen dezelfde gedeelde Hindsight-bank.</w:t>
+      </w:r>
+    </w:p>
+    <w:p>
+      <w:r>
+        <w:rPr>
+          <w:b w:val="0"/>
+        </w:rPr>
+        <w:t>De actieve laag voor afgeleide kennis is Cognition in Gaia-Cloud: Logos stelt voor, Cognition beheert de levenscyclus (proposed, testing, corroborated, confirmed, rejected), en het bevestigen door een mens loopt via GaiaChat. Bevestigde uitspraken worden gespiegeld naar Hindsight. Zie docs/architecture.md in Gaia-Cloud. Waar de tekst hieronder Foundation noemt als beheerder van hypotheses, lees dan: de bron waar ze naar verwijzen.</w:t>
       </w:r>
     </w:p>
     <w:p>
@@ -1421,7 +1445,7 @@
           <w:rFonts w:ascii="Google Sans" w:eastAsia="Google Sans" w:hAnsi="Google Sans" w:cs="Google Sans"/>
           <w:lang w:val="nl-NL"/>
         </w:rPr>
-        <w:t>Foundation kan naast de bron ook epistemische objecten beheren:</w:t>
+        <w:t>Foundation heeft naast de bron ruimte voor epistemische objecten (zie de bijwerking bovenaan):</w:t>
       </w:r>
     </w:p>
     <w:p>
@@ -2564,7 +2588,7 @@
           <w:lang w:val="nl-NL"/>
         </w:rPr>
         <w:br/>
-        <w:t>Dat vereist de expliciete menselijke validatie van de Absolute Override, zoals ook in de huidige Foundation-specificatie staat. v3.0-foundation-v2 (1)</w:t>
+        <w:t>Dat vereist de expliciete menselijke validatie van de Absolute Override, zoals ook in de huidige Foundation-specificatie staat.</w:t>
       </w:r>
     </w:p>
     <w:p>
@@ -2821,7 +2845,7 @@
           <w:rFonts w:ascii="Google Sans" w:eastAsia="Google Sans" w:hAnsi="Google Sans" w:cs="Google Sans"/>
           <w:lang w:val="nl-NL"/>
         </w:rPr>
-        <w:t xml:space="preserve">Een limiet van </w:t>
+        <w:t>Een limiet van 8000 tekens geldt dus nooit voor de opgeslagen bron. Als iets te groot, binair, base64 of anderszins ongeschikt is voor embedding: de bron blijft volledig bewaard.</w:t>
       </w:r>
       <w:r>
         <w:rPr>
@@ -2829,39 +2853,34 @@
           <w:color w:val="188038"/>
           <w:lang w:val="nl-NL"/>
         </w:rPr>
-        <w:t>8000</w:t>
-      </w:r>
-      <w:r>
-        <w:rPr>
-          <w:rFonts w:ascii="Google Sans" w:eastAsia="Google Sans" w:hAnsi="Google Sans" w:cs="Google Sans"/>
-          <w:lang w:val="nl-NL"/>
-        </w:rPr>
-        <w:t xml:space="preserve"> tekens geldt dus </w:t>
-      </w:r>
-      <w:r>
-        <w:rPr>
-          <w:rFonts w:ascii="Google Sans" w:eastAsia="Google Sans" w:hAnsi="Google Sans" w:cs="Google Sans"/>
-          <w:b/>
-          <w:bCs/>
-          <w:lang w:val="nl-NL"/>
-        </w:rPr>
-        <w:t>nooit voor de opgeslagen bron</w:t>
-      </w:r>
-      <w:r>
-        <w:rPr>
-          <w:rFonts w:ascii="Google Sans" w:eastAsia="Google Sans" w:hAnsi="Google Sans" w:cs="Google Sans"/>
-          <w:lang w:val="nl-NL"/>
-        </w:rPr>
-        <w:t xml:space="preserve">.ls iets te groot, binair, base64 of anderszins ongeschikt is voor embedding: </w:t>
-      </w:r>
-      <w:r>
-        <w:rPr>
-          <w:rFonts w:ascii="Google Sans" w:eastAsia="Google Sans" w:hAnsi="Google Sans" w:cs="Google Sans"/>
-          <w:b/>
-          <w:bCs/>
-          <w:lang w:val="nl-NL"/>
-        </w:rPr>
-        <w:t>de bron blijft volledig bewaard.</w:t>
+      </w:r>
+      <w:r>
+        <w:rPr>
+          <w:rFonts w:ascii="Google Sans" w:eastAsia="Google Sans" w:hAnsi="Google Sans" w:cs="Google Sans"/>
+          <w:lang w:val="nl-NL"/>
+        </w:rPr>
+      </w:r>
+      <w:r>
+        <w:rPr>
+          <w:rFonts w:ascii="Google Sans" w:eastAsia="Google Sans" w:hAnsi="Google Sans" w:cs="Google Sans"/>
+          <w:b/>
+          <w:bCs/>
+          <w:lang w:val="nl-NL"/>
+        </w:rPr>
+      </w:r>
+      <w:r>
+        <w:rPr>
+          <w:rFonts w:ascii="Google Sans" w:eastAsia="Google Sans" w:hAnsi="Google Sans" w:cs="Google Sans"/>
+          <w:lang w:val="nl-NL"/>
+        </w:rPr>
+      </w:r>
+      <w:r>
+        <w:rPr>
+          <w:rFonts w:ascii="Google Sans" w:eastAsia="Google Sans" w:hAnsi="Google Sans" w:cs="Google Sans"/>
+          <w:b/>
+          <w:bCs/>
+          <w:lang w:val="nl-NL"/>
+        </w:rPr>
       </w:r>
     </w:p>
     <w:p>

</xml_diff>